<commit_message>
Capstone: rename answer template to response sheet; remove hints from templates; docx only
</commit_message>
<xml_diff>
--- a/capstone/Architecture_Canvas.docx
+++ b/capstone/Architecture_Canvas.docx
@@ -133,7 +133,7 @@
                 <w:b w:val="0"/>
                 <w:sz w:val="19"/>
               </w:rPr>
-              <w:t>Who is the user? Which decision or task improves? What is the baseline today? 2 to 3 KPIs (business and technical). What does 'good' look like?</w:t>
+              <w:t>Who is the user? Which decision or task improves? What is the baseline today? Which 2 to 3 measures show success?</w:t>
             </w:r>
           </w:p>
         </w:tc>
@@ -195,7 +195,7 @@
                 <w:b w:val="0"/>
                 <w:sz w:val="19"/>
               </w:rPr>
-              <w:t>What data exists (structured, unstructured, streaming)? Quality, freshness, labels, owners. Sensitive data and who may see what?</w:t>
+              <w:t>What data exists, in what form? How good and how fresh is it? Who owns it and who may see what?</w:t>
             </w:r>
           </w:p>
         </w:tc>
@@ -243,7 +243,7 @@
                 <w:b/>
                 <w:sz w:val="19"/>
               </w:rPr>
-              <w:t>3  Approach: rules, ML, RAG, agent or hybrid</w:t>
+              <w:t>3  Approach</w:t>
             </w:r>
           </w:p>
         </w:tc>
@@ -257,7 +257,7 @@
                 <w:b w:val="0"/>
                 <w:sz w:val="19"/>
               </w:rPr>
-              <w:t>Which of the seven gates apply? Why this rung of the ladder and not a simpler one? Fine-tune, prompt or RAG, and why?</w:t>
+              <w:t>Is AI the right tool? Which approach fits (rules, ML, retrieval, agent, or a mix) and why not a simpler one?</w:t>
             </w:r>
           </w:p>
         </w:tc>
@@ -305,7 +305,7 @@
                 <w:b/>
                 <w:sz w:val="19"/>
               </w:rPr>
-              <w:t>4  Retrieval and answer quality</w:t>
+              <w:t>4  Finding information and answer quality</w:t>
             </w:r>
           </w:p>
         </w:tc>
@@ -319,7 +319,7 @@
                 <w:b w:val="0"/>
                 <w:sz w:val="19"/>
               </w:rPr>
-              <w:t>Chunking, embeddings, vector or hybrid search, filters and access control, reranking. How do you measure quality (golden set, Recall@k)? Hallucination controls and refusals.</w:t>
+              <w:t>How will the system find the right information? How will you measure quality? What stops wrong or made-up answers?</w:t>
             </w:r>
           </w:p>
         </w:tc>
@@ -367,7 +367,7 @@
                 <w:b/>
                 <w:sz w:val="19"/>
               </w:rPr>
-              <w:t>5  Agents, tools and MCP</w:t>
+              <w:t>5  Agents and tools</w:t>
             </w:r>
           </w:p>
         </w:tc>
@@ -381,7 +381,7 @@
                 <w:b w:val="0"/>
                 <w:sz w:val="19"/>
               </w:rPr>
-              <w:t>Does it need an agent? Which tools (search, SQL, APIs)? Which pattern (ReAct, plan-and-execute, router, human-in-the-loop)? Step limits, approvals, MCP servers.</w:t>
+              <w:t>Does it need an agent? What can it use and what limits apply? Who approves risky actions? How do tools connect?</w:t>
             </w:r>
           </w:p>
         </w:tc>
@@ -429,7 +429,7 @@
                 <w:b/>
                 <w:sz w:val="19"/>
               </w:rPr>
-              <w:t>6  MLOps, monitoring and release</w:t>
+              <w:t>6  Release and monitoring</w:t>
             </w:r>
           </w:p>
         </w:tc>
@@ -443,7 +443,7 @@
                 <w:b w:val="0"/>
                 <w:sz w:val="19"/>
               </w:rPr>
-              <w:t>Versioning and tracking, CI/CD, quality gates, monitoring (data, model, system, business), drift and retrain triggers, A/B or canary release.</w:t>
+              <w:t>How do you version, test, release and monitor it? What would make you retrain or roll back?</w:t>
             </w:r>
           </w:p>
         </w:tc>
@@ -491,7 +491,7 @@
                 <w:b/>
                 <w:sz w:val="19"/>
               </w:rPr>
-              <w:t>7  Cloud services and deployment</w:t>
+              <w:t>7  Cloud and deployment</w:t>
             </w:r>
           </w:p>
         </w:tc>
@@ -505,7 +505,7 @@
                 <w:b w:val="0"/>
                 <w:sz w:val="19"/>
               </w:rPr>
-              <w:t>Which cloud services (models, search, ML platform, agents)? Serverless, containers or managed APIs? Region and data residency. Integration with CRM, ERP, data warehouse.</w:t>
+              <w:t>Which services and how is it deployed? Where does data live? What does it connect to in the enterprise?</w:t>
             </w:r>
           </w:p>
         </w:tc>
@@ -567,7 +567,7 @@
                 <w:b w:val="0"/>
                 <w:sz w:val="19"/>
               </w:rPr>
-              <w:t>Bias and fairness checks, explainability, prompt-injection and leakage defences, PII handling, GDPR / RBI / HIPAA relevance, governance and human oversight.</w:t>
+              <w:t>Fairness and explanations, attacks and leaks, personal data, regulation, human oversight.</w:t>
             </w:r>
           </w:p>
         </w:tc>
@@ -629,7 +629,7 @@
                 <w:b w:val="0"/>
                 <w:sz w:val="19"/>
               </w:rPr>
-              <w:t>Rough cost per 1,000 requests, latency target (p95), top 3 risks with mitigations, what you would build first (MVP) and what you would defer.</w:t>
+              <w:t>What does it cost per 1,000 requests? What response time is needed? Top risks and how you reduce them. What do you build first?</w:t>
             </w:r>
           </w:p>
         </w:tc>

</xml_diff>